<commit_message>
Add a table border
</commit_message>
<xml_diff>
--- a/table.docx
+++ b/table.docx
@@ -47,7 +47,6 @@
               <w:bottom w:val="single" w:sz="16" w:space="0" w:color="D3D3D3"/>
               <w:end w:val="single" w:space="0" w:color="D3D3D3"/>
             </w:tcBorders>
-            <w:shd w:val="clear" w:color="auto" w:fill="BFBFBF"/>
             <w:gridSpan w:val="3"/>
           </w:tcPr>
           <w:p>
@@ -97,7 +96,6 @@
             <w:tcBorders>
               <w:bottom w:val="single" w:sz="16" w:space="0" w:color="D3D3D3"/>
             </w:tcBorders>
-            <w:shd w:val="clear" w:color="auto" w:fill="BFBFBF"/>
             <w:gridSpan w:val="1"/>
           </w:tcPr>
           <w:p>
@@ -120,7 +118,6 @@
             <w:tcBorders>
               <w:bottom w:val="single" w:sz="16" w:space="0" w:color="D3D3D3"/>
             </w:tcBorders>
-            <w:shd w:val="clear" w:color="auto" w:fill="BFBFBF"/>
             <w:gridSpan w:val="1"/>
           </w:tcPr>
           <w:p>
@@ -144,7 +141,6 @@
               <w:bottom w:val="single" w:sz="16" w:space="0" w:color="D3D3D3"/>
               <w:end w:val="single" w:space="0" w:color="D3D3D3"/>
             </w:tcBorders>
-            <w:shd w:val="clear" w:color="auto" w:fill="BFBFBF"/>
             <w:gridSpan w:val="1"/>
           </w:tcPr>
           <w:p>
@@ -174,7 +170,6 @@
               <w:bottom w:val="single" w:sz="16" w:space="0" w:color="D3D3D3"/>
               <w:start w:val="single" w:space="0" w:color="D3D3D3"/>
             </w:tcBorders>
-            <w:shd w:val="clear" w:color="auto" w:fill="BFBFBF"/>
           </w:tcPr>
         </w:tc>
         <w:tc>
@@ -182,7 +177,6 @@
             <w:tcBorders>
               <w:bottom w:val="single" w:sz="16" w:space="0" w:color="D3D3D3"/>
             </w:tcBorders>
-            <w:shd w:val="clear" w:color="auto" w:fill="BFBFBF"/>
           </w:tcPr>
           <w:p>
             <w:pPr>
@@ -212,7 +206,6 @@
             <w:tcBorders>
               <w:bottom w:val="single" w:sz="16" w:space="0" w:color="D3D3D3"/>
             </w:tcBorders>
-            <w:shd w:val="clear" w:color="auto" w:fill="BFBFBF"/>
           </w:tcPr>
           <w:p>
             <w:pPr>
@@ -243,7 +236,6 @@
               <w:bottom w:val="single" w:sz="16" w:space="0" w:color="D3D3D3"/>
               <w:end w:val="single" w:space="0" w:color="D3D3D3"/>
             </w:tcBorders>
-            <w:shd w:val="clear" w:color="auto" w:fill="BFBFBF"/>
           </w:tcPr>
           <w:p>
             <w:pPr>
@@ -281,6 +273,7 @@
               <w:start w:val="single" w:space="0" w:color="D3D3D3"/>
               <w:end w:val="single" w:space="0" w:color="D3D3D3"/>
             </w:tcBorders>
+            <w:shd w:val="clear" w:color="auto" w:fill="E5E5E5"/>
           </w:tcPr>
           <w:p>
             <w:pPr>
@@ -306,6 +299,7 @@
               <w:start w:val="single" w:space="0" w:color="D3D3D3"/>
               <w:end w:val="single" w:space="0" w:color="D3D3D3"/>
             </w:tcBorders>
+            <w:shd w:val="clear" w:color="auto" w:fill="F2F2F2"/>
           </w:tcPr>
           <w:p>
             <w:pPr>
@@ -330,6 +324,7 @@
               <w:start w:val="single" w:space="0" w:color="D3D3D3"/>
               <w:end w:val="single" w:space="0" w:color="D3D3D3"/>
             </w:tcBorders>
+            <w:shd w:val="clear" w:color="auto" w:fill="F2F2F2"/>
           </w:tcPr>
           <w:p>
             <w:pPr>
@@ -354,6 +349,7 @@
               <w:start w:val="single" w:space="0" w:color="D3D3D3"/>
               <w:end w:val="single" w:space="0" w:color="D3D3D3"/>
             </w:tcBorders>
+            <w:shd w:val="clear" w:color="auto" w:fill="F2F2F2"/>
           </w:tcPr>
           <w:p>
             <w:pPr>
@@ -383,6 +379,7 @@
               <w:start w:val="single" w:space="0" w:color="D3D3D3"/>
               <w:end w:val="single" w:space="0" w:color="D3D3D3"/>
             </w:tcBorders>
+            <w:shd w:val="clear" w:color="auto" w:fill="E5E5E5"/>
           </w:tcPr>
           <w:p>
             <w:pPr>
@@ -485,6 +482,7 @@
               <w:start w:val="single" w:space="0" w:color="D3D3D3"/>
               <w:end w:val="single" w:space="0" w:color="D3D3D3"/>
             </w:tcBorders>
+            <w:shd w:val="clear" w:color="auto" w:fill="E5E5E5"/>
           </w:tcPr>
           <w:p>
             <w:pPr>
@@ -510,6 +508,7 @@
               <w:start w:val="single" w:space="0" w:color="D3D3D3"/>
               <w:end w:val="single" w:space="0" w:color="D3D3D3"/>
             </w:tcBorders>
+            <w:shd w:val="clear" w:color="auto" w:fill="F2F2F2"/>
           </w:tcPr>
           <w:p>
             <w:pPr>
@@ -534,6 +533,7 @@
               <w:start w:val="single" w:space="0" w:color="D3D3D3"/>
               <w:end w:val="single" w:space="0" w:color="D3D3D3"/>
             </w:tcBorders>
+            <w:shd w:val="clear" w:color="auto" w:fill="F2F2F2"/>
           </w:tcPr>
           <w:p>
             <w:pPr>
@@ -558,6 +558,7 @@
               <w:start w:val="single" w:space="0" w:color="D3D3D3"/>
               <w:end w:val="single" w:space="0" w:color="D3D3D3"/>
             </w:tcBorders>
+            <w:shd w:val="clear" w:color="auto" w:fill="F2F2F2"/>
           </w:tcPr>
           <w:p>
             <w:pPr>
@@ -587,6 +588,7 @@
               <w:start w:val="single" w:space="0" w:color="D3D3D3"/>
               <w:end w:val="single" w:space="0" w:color="D3D3D3"/>
             </w:tcBorders>
+            <w:shd w:val="clear" w:color="auto" w:fill="E5E5E5"/>
           </w:tcPr>
           <w:p>
             <w:pPr>
@@ -689,6 +691,7 @@
               <w:start w:val="single" w:space="0" w:color="D3D3D3"/>
               <w:end w:val="single" w:space="0" w:color="D3D3D3"/>
             </w:tcBorders>
+            <w:shd w:val="clear" w:color="auto" w:fill="E5E5E5"/>
           </w:tcPr>
           <w:p>
             <w:pPr>
@@ -714,6 +717,7 @@
               <w:start w:val="single" w:space="0" w:color="D3D3D3"/>
               <w:end w:val="single" w:space="0" w:color="D3D3D3"/>
             </w:tcBorders>
+            <w:shd w:val="clear" w:color="auto" w:fill="F2F2F2"/>
           </w:tcPr>
           <w:p>
             <w:pPr>
@@ -738,6 +742,7 @@
               <w:start w:val="single" w:space="0" w:color="D3D3D3"/>
               <w:end w:val="single" w:space="0" w:color="D3D3D3"/>
             </w:tcBorders>
+            <w:shd w:val="clear" w:color="auto" w:fill="F2F2F2"/>
           </w:tcPr>
           <w:p>
             <w:pPr>
@@ -762,6 +767,7 @@
               <w:start w:val="single" w:space="0" w:color="D3D3D3"/>
               <w:end w:val="single" w:space="0" w:color="D3D3D3"/>
             </w:tcBorders>
+            <w:shd w:val="clear" w:color="auto" w:fill="F2F2F2"/>
           </w:tcPr>
           <w:p>
             <w:pPr>
@@ -791,6 +797,7 @@
               <w:start w:val="single" w:space="0" w:color="D3D3D3"/>
               <w:end w:val="single" w:space="0" w:color="D3D3D3"/>
             </w:tcBorders>
+            <w:shd w:val="clear" w:color="auto" w:fill="E5E5E5"/>
           </w:tcPr>
           <w:p>
             <w:pPr>
@@ -893,6 +900,7 @@
               <w:start w:val="single" w:space="0" w:color="D3D3D3"/>
               <w:end w:val="single" w:space="0" w:color="D3D3D3"/>
             </w:tcBorders>
+            <w:shd w:val="clear" w:color="auto" w:fill="E5E5E5"/>
           </w:tcPr>
           <w:p>
             <w:pPr>
@@ -918,6 +926,7 @@
               <w:start w:val="single" w:space="0" w:color="D3D3D3"/>
               <w:end w:val="single" w:space="0" w:color="D3D3D3"/>
             </w:tcBorders>
+            <w:shd w:val="clear" w:color="auto" w:fill="F2F2F2"/>
           </w:tcPr>
           <w:p>
             <w:pPr>
@@ -942,6 +951,7 @@
               <w:start w:val="single" w:space="0" w:color="D3D3D3"/>
               <w:end w:val="single" w:space="0" w:color="D3D3D3"/>
             </w:tcBorders>
+            <w:shd w:val="clear" w:color="auto" w:fill="F2F2F2"/>
           </w:tcPr>
           <w:p>
             <w:pPr>
@@ -966,6 +976,7 @@
               <w:start w:val="single" w:space="0" w:color="D3D3D3"/>
               <w:end w:val="single" w:space="0" w:color="D3D3D3"/>
             </w:tcBorders>
+            <w:shd w:val="clear" w:color="auto" w:fill="F2F2F2"/>
           </w:tcPr>
           <w:p>
             <w:pPr>
@@ -995,6 +1006,7 @@
               <w:start w:val="single" w:space="0" w:color="D3D3D3"/>
               <w:end w:val="single" w:space="0" w:color="D3D3D3"/>
             </w:tcBorders>
+            <w:shd w:val="clear" w:color="auto" w:fill="E5E5E5"/>
           </w:tcPr>
           <w:p>
             <w:pPr>
@@ -1097,6 +1109,7 @@
               <w:start w:val="single" w:space="0" w:color="D3D3D3"/>
               <w:end w:val="single" w:space="0" w:color="D3D3D3"/>
             </w:tcBorders>
+            <w:shd w:val="clear" w:color="auto" w:fill="E5E5E5"/>
           </w:tcPr>
           <w:p>
             <w:pPr>
@@ -1122,6 +1135,7 @@
               <w:start w:val="single" w:space="0" w:color="D3D3D3"/>
               <w:end w:val="single" w:space="0" w:color="D3D3D3"/>
             </w:tcBorders>
+            <w:shd w:val="clear" w:color="auto" w:fill="F2F2F2"/>
           </w:tcPr>
           <w:p>
             <w:pPr>
@@ -1146,6 +1160,7 @@
               <w:start w:val="single" w:space="0" w:color="D3D3D3"/>
               <w:end w:val="single" w:space="0" w:color="D3D3D3"/>
             </w:tcBorders>
+            <w:shd w:val="clear" w:color="auto" w:fill="F2F2F2"/>
           </w:tcPr>
           <w:p>
             <w:pPr>
@@ -1170,6 +1185,7 @@
               <w:start w:val="single" w:space="0" w:color="D3D3D3"/>
               <w:end w:val="single" w:space="0" w:color="D3D3D3"/>
             </w:tcBorders>
+            <w:shd w:val="clear" w:color="auto" w:fill="F2F2F2"/>
           </w:tcPr>
           <w:p>
             <w:pPr>
@@ -1199,6 +1215,7 @@
               <w:start w:val="single" w:space="0" w:color="D3D3D3"/>
               <w:end w:val="single" w:space="0" w:color="D3D3D3"/>
             </w:tcBorders>
+            <w:shd w:val="clear" w:color="auto" w:fill="E5E5E5"/>
           </w:tcPr>
           <w:p>
             <w:pPr>
@@ -1301,6 +1318,7 @@
               <w:start w:val="single" w:space="0" w:color="D3D3D3"/>
               <w:end w:val="single" w:space="0" w:color="D3D3D3"/>
             </w:tcBorders>
+            <w:shd w:val="clear" w:color="auto" w:fill="E5E5E5"/>
           </w:tcPr>
           <w:p>
             <w:pPr>
@@ -1326,6 +1344,7 @@
               <w:start w:val="single" w:space="0" w:color="D3D3D3"/>
               <w:end w:val="single" w:space="0" w:color="D3D3D3"/>
             </w:tcBorders>
+            <w:shd w:val="clear" w:color="auto" w:fill="F2F2F2"/>
           </w:tcPr>
           <w:p>
             <w:pPr>
@@ -1350,6 +1369,7 @@
               <w:start w:val="single" w:space="0" w:color="D3D3D3"/>
               <w:end w:val="single" w:space="0" w:color="D3D3D3"/>
             </w:tcBorders>
+            <w:shd w:val="clear" w:color="auto" w:fill="F2F2F2"/>
           </w:tcPr>
           <w:p>
             <w:pPr>
@@ -1374,6 +1394,7 @@
               <w:start w:val="single" w:space="0" w:color="D3D3D3"/>
               <w:end w:val="single" w:space="0" w:color="D3D3D3"/>
             </w:tcBorders>
+            <w:shd w:val="clear" w:color="auto" w:fill="F2F2F2"/>
           </w:tcPr>
           <w:p>
             <w:pPr>
@@ -1403,6 +1424,7 @@
               <w:start w:val="single" w:space="0" w:color="D3D3D3"/>
               <w:end w:val="single" w:space="0" w:color="D3D3D3"/>
             </w:tcBorders>
+            <w:shd w:val="clear" w:color="auto" w:fill="E5E5E5"/>
           </w:tcPr>
           <w:p>
             <w:pPr>
@@ -1505,6 +1527,7 @@
               <w:start w:val="single" w:space="0" w:color="D3D3D3"/>
               <w:end w:val="single" w:space="0" w:color="D3D3D3"/>
             </w:tcBorders>
+            <w:shd w:val="clear" w:color="auto" w:fill="E5E5E5"/>
           </w:tcPr>
           <w:p>
             <w:pPr>
@@ -1530,6 +1553,7 @@
               <w:start w:val="single" w:space="0" w:color="D3D3D3"/>
               <w:end w:val="single" w:space="0" w:color="D3D3D3"/>
             </w:tcBorders>
+            <w:shd w:val="clear" w:color="auto" w:fill="F2F2F2"/>
           </w:tcPr>
           <w:p>
             <w:pPr>
@@ -1554,6 +1578,7 @@
               <w:start w:val="single" w:space="0" w:color="D3D3D3"/>
               <w:end w:val="single" w:space="0" w:color="D3D3D3"/>
             </w:tcBorders>
+            <w:shd w:val="clear" w:color="auto" w:fill="F2F2F2"/>
           </w:tcPr>
           <w:p>
             <w:pPr>
@@ -1578,6 +1603,7 @@
               <w:start w:val="single" w:space="0" w:color="D3D3D3"/>
               <w:end w:val="single" w:space="0" w:color="D3D3D3"/>
             </w:tcBorders>
+            <w:shd w:val="clear" w:color="auto" w:fill="F2F2F2"/>
           </w:tcPr>
           <w:p>
             <w:pPr>
@@ -1607,6 +1633,7 @@
               <w:start w:val="single" w:space="0" w:color="D3D3D3"/>
               <w:end w:val="single" w:space="0" w:color="D3D3D3"/>
             </w:tcBorders>
+            <w:shd w:val="clear" w:color="auto" w:fill="E5E5E5"/>
           </w:tcPr>
           <w:p>
             <w:pPr>
@@ -1709,6 +1736,7 @@
               <w:start w:val="single" w:space="0" w:color="D3D3D3"/>
               <w:end w:val="single" w:space="0" w:color="D3D3D3"/>
             </w:tcBorders>
+            <w:shd w:val="clear" w:color="auto" w:fill="E5E5E5"/>
           </w:tcPr>
           <w:p>
             <w:pPr>
@@ -1734,6 +1762,7 @@
               <w:start w:val="single" w:space="0" w:color="D3D3D3"/>
               <w:end w:val="single" w:space="0" w:color="D3D3D3"/>
             </w:tcBorders>
+            <w:shd w:val="clear" w:color="auto" w:fill="F2F2F2"/>
           </w:tcPr>
           <w:p>
             <w:pPr>
@@ -1758,6 +1787,7 @@
               <w:start w:val="single" w:space="0" w:color="D3D3D3"/>
               <w:end w:val="single" w:space="0" w:color="D3D3D3"/>
             </w:tcBorders>
+            <w:shd w:val="clear" w:color="auto" w:fill="F2F2F2"/>
           </w:tcPr>
           <w:p>
             <w:pPr>
@@ -1782,6 +1812,7 @@
               <w:start w:val="single" w:space="0" w:color="D3D3D3"/>
               <w:end w:val="single" w:space="0" w:color="D3D3D3"/>
             </w:tcBorders>
+            <w:shd w:val="clear" w:color="auto" w:fill="F2F2F2"/>
           </w:tcPr>
           <w:p>
             <w:pPr>

</xml_diff>

<commit_message>
Add italics and centered items to table
</commit_message>
<xml_diff>
--- a/table.docx
+++ b/table.docx
@@ -82,7 +82,7 @@
             <w:pPr>
               <w:spacing w:before="0" w:after="60"/>
               <w:keepNext/>
-              <w:jc w:val="start"/>
+              <w:jc w:val="center"/>
             </w:pPr>
             <w:r>
               <w:rPr>
@@ -105,7 +105,7 @@
             <w:pPr>
               <w:spacing w:before="0" w:after="60"/>
               <w:keepNext/>
-              <w:jc w:val="start"/>
+              <w:jc w:val="center"/>
             </w:pPr>
             <w:r>
               <w:rPr>
@@ -128,7 +128,7 @@
             <w:pPr>
               <w:spacing w:before="0" w:after="60"/>
               <w:keepNext/>
-              <w:jc w:val="start"/>
+              <w:jc w:val="center"/>
             </w:pPr>
             <w:r>
               <w:rPr>
@@ -152,7 +152,7 @@
             <w:pPr>
               <w:spacing w:before="0" w:after="60"/>
               <w:keepNext/>
-              <w:jc w:val="start"/>
+              <w:jc w:val="center"/>
             </w:pPr>
             <w:r>
               <w:rPr>
@@ -191,7 +191,7 @@
               <w:rPr>
                 <w:rFonts w:ascii="Calibri" w:hAnsi="Calibri"/>
                 <w:sz w:val="20"/>
-                <w:b w:val="true"/>
+                <w:i/>
               </w:rPr>
               <w:t xml:space="default">Amantadine</w:t>
             </w:r>
@@ -215,7 +215,7 @@
             <w:pPr>
               <w:spacing w:before="0" w:after="60"/>
               <w:keepNext/>
-              <w:jc w:val="start"/>
+              <w:jc w:val="center"/>
             </w:pPr>
             <w:r>
               <w:rPr>
@@ -239,7 +239,7 @@
             <w:pPr>
               <w:spacing w:before="0" w:after="60"/>
               <w:keepNext/>
-              <w:jc w:val="start"/>
+              <w:jc w:val="center"/>
             </w:pPr>
             <w:r>
               <w:rPr>
@@ -263,7 +263,7 @@
             <w:pPr>
               <w:spacing w:before="0" w:after="60"/>
               <w:keepNext/>
-              <w:jc w:val="start"/>
+              <w:jc w:val="center"/>
             </w:pPr>
             <w:r>
               <w:rPr>
@@ -288,7 +288,7 @@
             <w:pPr>
               <w:spacing w:before="0" w:after="60"/>
               <w:keepNext/>
-              <w:jc w:val="start"/>
+              <w:jc w:val="center"/>
             </w:pPr>
             <w:r>
               <w:rPr>
@@ -317,7 +317,7 @@
             <w:pPr>
               <w:spacing w:before="0" w:after="60"/>
               <w:keepNext/>
-              <w:jc w:val="start"/>
+              <w:jc w:val="center"/>
             </w:pPr>
             <w:r>
               <w:rPr>
@@ -341,7 +341,7 @@
             <w:pPr>
               <w:spacing w:before="0" w:after="60"/>
               <w:keepNext/>
-              <w:jc w:val="start"/>
+              <w:jc w:val="center"/>
             </w:pPr>
             <w:r>
               <w:rPr>
@@ -365,7 +365,7 @@
             <w:pPr>
               <w:spacing w:before="0" w:after="60"/>
               <w:keepNext/>
-              <w:jc w:val="start"/>
+              <w:jc w:val="center"/>
             </w:pPr>
             <w:r>
               <w:rPr>
@@ -390,7 +390,7 @@
             <w:pPr>
               <w:spacing w:before="0" w:after="60"/>
               <w:keepNext/>
-              <w:jc w:val="start"/>
+              <w:jc w:val="center"/>
             </w:pPr>
             <w:r>
               <w:rPr>
@@ -419,7 +419,7 @@
             <w:pPr>
               <w:spacing w:before="0" w:after="60"/>
               <w:keepNext/>
-              <w:jc w:val="start"/>
+              <w:jc w:val="center"/>
             </w:pPr>
             <w:r>
               <w:rPr>
@@ -443,7 +443,7 @@
             <w:pPr>
               <w:spacing w:before="0" w:after="60"/>
               <w:keepNext/>
-              <w:jc w:val="start"/>
+              <w:jc w:val="center"/>
             </w:pPr>
             <w:r>
               <w:rPr>
@@ -467,7 +467,7 @@
             <w:pPr>
               <w:spacing w:before="0" w:after="60"/>
               <w:keepNext/>
-              <w:jc w:val="start"/>
+              <w:jc w:val="center"/>
             </w:pPr>
             <w:r>
               <w:rPr>
@@ -492,7 +492,7 @@
             <w:pPr>
               <w:spacing w:before="0" w:after="60"/>
               <w:keepNext/>
-              <w:jc w:val="start"/>
+              <w:jc w:val="center"/>
             </w:pPr>
             <w:r>
               <w:rPr>
@@ -521,7 +521,7 @@
             <w:pPr>
               <w:spacing w:before="0" w:after="60"/>
               <w:keepNext/>
-              <w:jc w:val="start"/>
+              <w:jc w:val="center"/>
             </w:pPr>
             <w:r>
               <w:rPr>
@@ -545,7 +545,7 @@
             <w:pPr>
               <w:spacing w:before="0" w:after="60"/>
               <w:keepNext/>
-              <w:jc w:val="start"/>
+              <w:jc w:val="center"/>
             </w:pPr>
             <w:r>
               <w:rPr>
@@ -569,7 +569,7 @@
             <w:pPr>
               <w:spacing w:before="0" w:after="60"/>
               <w:keepNext/>
-              <w:jc w:val="start"/>
+              <w:jc w:val="center"/>
             </w:pPr>
             <w:r>
               <w:rPr>
@@ -594,7 +594,7 @@
             <w:pPr>
               <w:spacing w:before="0" w:after="60"/>
               <w:keepNext/>
-              <w:jc w:val="start"/>
+              <w:jc w:val="center"/>
             </w:pPr>
             <w:r>
               <w:rPr>
@@ -632,7 +632,7 @@
               <w:rPr>
                 <w:rFonts w:ascii="Calibri" w:hAnsi="Calibri"/>
                 <w:sz w:val="20"/>
-                <w:b w:val="true"/>
+                <w:i/>
               </w:rPr>
               <w:t xml:space="default">Ambroxol</w:t>
             </w:r>
@@ -656,7 +656,7 @@
             <w:pPr>
               <w:spacing w:before="0" w:after="60"/>
               <w:keepNext/>
-              <w:jc w:val="start"/>
+              <w:jc w:val="center"/>
             </w:pPr>
             <w:r>
               <w:rPr>
@@ -680,7 +680,7 @@
             <w:pPr>
               <w:spacing w:before="0" w:after="60"/>
               <w:keepNext/>
-              <w:jc w:val="start"/>
+              <w:jc w:val="center"/>
             </w:pPr>
             <w:r>
               <w:rPr>
@@ -704,7 +704,7 @@
             <w:pPr>
               <w:spacing w:before="0" w:after="60"/>
               <w:keepNext/>
-              <w:jc w:val="start"/>
+              <w:jc w:val="center"/>
             </w:pPr>
             <w:r>
               <w:rPr>
@@ -729,7 +729,7 @@
             <w:pPr>
               <w:spacing w:before="0" w:after="60"/>
               <w:keepNext/>
-              <w:jc w:val="start"/>
+              <w:jc w:val="center"/>
             </w:pPr>
             <w:r>
               <w:rPr>
@@ -758,7 +758,7 @@
             <w:pPr>
               <w:spacing w:before="0" w:after="60"/>
               <w:keepNext/>
-              <w:jc w:val="start"/>
+              <w:jc w:val="center"/>
             </w:pPr>
             <w:r>
               <w:rPr>
@@ -782,7 +782,7 @@
             <w:pPr>
               <w:spacing w:before="0" w:after="60"/>
               <w:keepNext/>
-              <w:jc w:val="start"/>
+              <w:jc w:val="center"/>
             </w:pPr>
             <w:r>
               <w:rPr>
@@ -806,7 +806,7 @@
             <w:pPr>
               <w:spacing w:before="0" w:after="60"/>
               <w:keepNext/>
-              <w:jc w:val="start"/>
+              <w:jc w:val="center"/>
             </w:pPr>
             <w:r>
               <w:rPr>
@@ -831,7 +831,7 @@
             <w:pPr>
               <w:spacing w:before="0" w:after="60"/>
               <w:keepNext/>
-              <w:jc w:val="start"/>
+              <w:jc w:val="center"/>
             </w:pPr>
             <w:r>
               <w:rPr>
@@ -869,7 +869,7 @@
               <w:rPr>
                 <w:rFonts w:ascii="Calibri" w:hAnsi="Calibri"/>
                 <w:sz w:val="20"/>
-                <w:b w:val="true"/>
+                <w:i/>
               </w:rPr>
               <w:t xml:space="default">Baclofen</w:t>
             </w:r>
@@ -893,7 +893,7 @@
             <w:pPr>
               <w:spacing w:before="0" w:after="60"/>
               <w:keepNext/>
-              <w:jc w:val="start"/>
+              <w:jc w:val="center"/>
             </w:pPr>
             <w:r>
               <w:rPr>
@@ -917,7 +917,7 @@
             <w:pPr>
               <w:spacing w:before="0" w:after="60"/>
               <w:keepNext/>
-              <w:jc w:val="start"/>
+              <w:jc w:val="center"/>
             </w:pPr>
             <w:r>
               <w:rPr>
@@ -941,7 +941,7 @@
             <w:pPr>
               <w:spacing w:before="0" w:after="60"/>
               <w:keepNext/>
-              <w:jc w:val="start"/>
+              <w:jc w:val="center"/>
             </w:pPr>
             <w:r>
               <w:rPr>
@@ -966,7 +966,7 @@
             <w:pPr>
               <w:spacing w:before="0" w:after="60"/>
               <w:keepNext/>
-              <w:jc w:val="start"/>
+              <w:jc w:val="center"/>
             </w:pPr>
             <w:r>
               <w:rPr>
@@ -1004,7 +1004,7 @@
               <w:rPr>
                 <w:rFonts w:ascii="Calibri" w:hAnsi="Calibri"/>
                 <w:sz w:val="20"/>
-                <w:b w:val="true"/>
+                <w:i/>
               </w:rPr>
               <w:t xml:space="default">Cannabidiol</w:t>
             </w:r>
@@ -1028,7 +1028,7 @@
             <w:pPr>
               <w:spacing w:before="0" w:after="60"/>
               <w:keepNext/>
-              <w:jc w:val="start"/>
+              <w:jc w:val="center"/>
             </w:pPr>
             <w:r>
               <w:rPr>
@@ -1052,7 +1052,7 @@
             <w:pPr>
               <w:spacing w:before="0" w:after="60"/>
               <w:keepNext/>
-              <w:jc w:val="start"/>
+              <w:jc w:val="center"/>
             </w:pPr>
             <w:r>
               <w:rPr>
@@ -1076,7 +1076,7 @@
             <w:pPr>
               <w:spacing w:before="0" w:after="60"/>
               <w:keepNext/>
-              <w:jc w:val="start"/>
+              <w:jc w:val="center"/>
             </w:pPr>
             <w:r>
               <w:rPr>
@@ -1101,7 +1101,7 @@
             <w:pPr>
               <w:spacing w:before="0" w:after="60"/>
               <w:keepNext/>
-              <w:jc w:val="start"/>
+              <w:jc w:val="center"/>
             </w:pPr>
             <w:r>
               <w:rPr>
@@ -1130,7 +1130,7 @@
             <w:pPr>
               <w:spacing w:before="0" w:after="60"/>
               <w:keepNext/>
-              <w:jc w:val="start"/>
+              <w:jc w:val="center"/>
             </w:pPr>
             <w:r>
               <w:rPr>
@@ -1154,7 +1154,7 @@
             <w:pPr>
               <w:spacing w:before="0" w:after="60"/>
               <w:keepNext/>
-              <w:jc w:val="start"/>
+              <w:jc w:val="center"/>
             </w:pPr>
             <w:r>
               <w:rPr>
@@ -1178,7 +1178,7 @@
             <w:pPr>
               <w:spacing w:before="0" w:after="60"/>
               <w:keepNext/>
-              <w:jc w:val="start"/>
+              <w:jc w:val="center"/>
             </w:pPr>
             <w:r>
               <w:rPr>
@@ -1203,7 +1203,7 @@
             <w:pPr>
               <w:spacing w:before="0" w:after="60"/>
               <w:keepNext/>
-              <w:jc w:val="start"/>
+              <w:jc w:val="center"/>
             </w:pPr>
             <w:r>
               <w:rPr>
@@ -1241,7 +1241,7 @@
               <w:rPr>
                 <w:rFonts w:ascii="Calibri" w:hAnsi="Calibri"/>
                 <w:sz w:val="20"/>
-                <w:b w:val="true"/>
+                <w:i/>
               </w:rPr>
               <w:t xml:space="default">Carnitine</w:t>
             </w:r>
@@ -1265,7 +1265,7 @@
             <w:pPr>
               <w:spacing w:before="0" w:after="60"/>
               <w:keepNext/>
-              <w:jc w:val="start"/>
+              <w:jc w:val="center"/>
             </w:pPr>
             <w:r>
               <w:rPr>
@@ -1289,7 +1289,7 @@
             <w:pPr>
               <w:spacing w:before="0" w:after="60"/>
               <w:keepNext/>
-              <w:jc w:val="start"/>
+              <w:jc w:val="center"/>
             </w:pPr>
             <w:r>
               <w:rPr>
@@ -1313,7 +1313,7 @@
             <w:pPr>
               <w:spacing w:before="0" w:after="60"/>
               <w:keepNext/>
-              <w:jc w:val="start"/>
+              <w:jc w:val="center"/>
             </w:pPr>
             <w:r>
               <w:rPr>
@@ -1338,7 +1338,7 @@
             <w:pPr>
               <w:spacing w:before="0" w:after="60"/>
               <w:keepNext/>
-              <w:jc w:val="start"/>
+              <w:jc w:val="center"/>
             </w:pPr>
             <w:r>
               <w:rPr>
@@ -1367,7 +1367,7 @@
             <w:pPr>
               <w:spacing w:before="0" w:after="60"/>
               <w:keepNext/>
-              <w:jc w:val="start"/>
+              <w:jc w:val="center"/>
             </w:pPr>
             <w:r>
               <w:rPr>
@@ -1391,7 +1391,7 @@
             <w:pPr>
               <w:spacing w:before="0" w:after="60"/>
               <w:keepNext/>
-              <w:jc w:val="start"/>
+              <w:jc w:val="center"/>
             </w:pPr>
             <w:r>
               <w:rPr>
@@ -1415,7 +1415,7 @@
             <w:pPr>
               <w:spacing w:before="0" w:after="60"/>
               <w:keepNext/>
-              <w:jc w:val="start"/>
+              <w:jc w:val="center"/>
             </w:pPr>
             <w:r>
               <w:rPr>
@@ -1440,7 +1440,7 @@
             <w:pPr>
               <w:spacing w:before="0" w:after="60"/>
               <w:keepNext/>
-              <w:jc w:val="start"/>
+              <w:jc w:val="center"/>
             </w:pPr>
             <w:r>
               <w:rPr>
@@ -1478,7 +1478,7 @@
               <w:rPr>
                 <w:rFonts w:ascii="Calibri" w:hAnsi="Calibri"/>
                 <w:sz w:val="20"/>
-                <w:b w:val="true"/>
+                <w:i/>
               </w:rPr>
               <w:t xml:space="default">Disulfiram</w:t>
             </w:r>
@@ -1502,7 +1502,7 @@
             <w:pPr>
               <w:spacing w:before="0" w:after="60"/>
               <w:keepNext/>
-              <w:jc w:val="start"/>
+              <w:jc w:val="center"/>
             </w:pPr>
             <w:r>
               <w:rPr>
@@ -1526,7 +1526,7 @@
             <w:pPr>
               <w:spacing w:before="0" w:after="60"/>
               <w:keepNext/>
-              <w:jc w:val="start"/>
+              <w:jc w:val="center"/>
             </w:pPr>
             <w:r>
               <w:rPr>
@@ -1550,7 +1550,7 @@
             <w:pPr>
               <w:spacing w:before="0" w:after="60"/>
               <w:keepNext/>
-              <w:jc w:val="start"/>
+              <w:jc w:val="center"/>
             </w:pPr>
             <w:r>
               <w:rPr>
@@ -1575,7 +1575,7 @@
             <w:pPr>
               <w:spacing w:before="0" w:after="60"/>
               <w:keepNext/>
-              <w:jc w:val="start"/>
+              <w:jc w:val="center"/>
             </w:pPr>
             <w:r>
               <w:rPr>
@@ -1604,7 +1604,7 @@
             <w:pPr>
               <w:spacing w:before="0" w:after="60"/>
               <w:keepNext/>
-              <w:jc w:val="start"/>
+              <w:jc w:val="center"/>
             </w:pPr>
             <w:r>
               <w:rPr>
@@ -1628,7 +1628,7 @@
             <w:pPr>
               <w:spacing w:before="0" w:after="60"/>
               <w:keepNext/>
-              <w:jc w:val="start"/>
+              <w:jc w:val="center"/>
             </w:pPr>
             <w:r>
               <w:rPr>
@@ -1652,7 +1652,7 @@
             <w:pPr>
               <w:spacing w:before="0" w:after="60"/>
               <w:keepNext/>
-              <w:jc w:val="start"/>
+              <w:jc w:val="center"/>
             </w:pPr>
             <w:r>
               <w:rPr>
@@ -1677,7 +1677,7 @@
             <w:pPr>
               <w:spacing w:before="0" w:after="60"/>
               <w:keepNext/>
-              <w:jc w:val="start"/>
+              <w:jc w:val="center"/>
             </w:pPr>
             <w:r>
               <w:rPr>
@@ -1715,7 +1715,7 @@
               <w:rPr>
                 <w:rFonts w:ascii="Calibri" w:hAnsi="Calibri"/>
                 <w:sz w:val="20"/>
-                <w:b w:val="true"/>
+                <w:i/>
               </w:rPr>
               <w:t xml:space="default">Entacapone</w:t>
             </w:r>
@@ -1749,7 +1749,7 @@
             <w:pPr>
               <w:spacing w:before="0" w:after="60"/>
               <w:keepNext/>
-              <w:jc w:val="start"/>
+              <w:jc w:val="center"/>
             </w:pPr>
             <w:r>
               <w:rPr>
@@ -1773,7 +1773,7 @@
             <w:pPr>
               <w:spacing w:before="0" w:after="60"/>
               <w:keepNext/>
-              <w:jc w:val="start"/>
+              <w:jc w:val="center"/>
             </w:pPr>
             <w:r>
               <w:rPr>
@@ -1798,7 +1798,7 @@
             <w:pPr>
               <w:spacing w:before="0" w:after="60"/>
               <w:keepNext/>
-              <w:jc w:val="start"/>
+              <w:jc w:val="center"/>
             </w:pPr>
             <w:r>
               <w:rPr>
@@ -1837,7 +1837,7 @@
             <w:pPr>
               <w:spacing w:before="0" w:after="60"/>
               <w:keepNext/>
-              <w:jc w:val="start"/>
+              <w:jc w:val="center"/>
             </w:pPr>
             <w:r>
               <w:rPr>
@@ -1861,7 +1861,7 @@
             <w:pPr>
               <w:spacing w:before="0" w:after="60"/>
               <w:keepNext/>
-              <w:jc w:val="start"/>
+              <w:jc w:val="center"/>
             </w:pPr>
             <w:r>
               <w:rPr>
@@ -1886,7 +1886,7 @@
             <w:pPr>
               <w:spacing w:before="0" w:after="60"/>
               <w:keepNext/>
-              <w:jc w:val="start"/>
+              <w:jc w:val="center"/>
             </w:pPr>
             <w:r>
               <w:rPr>
@@ -1925,7 +1925,7 @@
             <w:pPr>
               <w:spacing w:before="0" w:after="60"/>
               <w:keepNext/>
-              <w:jc w:val="start"/>
+              <w:jc w:val="center"/>
             </w:pPr>
             <w:r>
               <w:rPr>
@@ -1949,7 +1949,7 @@
             <w:pPr>
               <w:spacing w:before="0" w:after="60"/>
               <w:keepNext/>
-              <w:jc w:val="start"/>
+              <w:jc w:val="center"/>
             </w:pPr>
             <w:r>
               <w:rPr>
@@ -1974,7 +1974,7 @@
             <w:pPr>
               <w:spacing w:before="0" w:after="60"/>
               <w:keepNext/>
-              <w:jc w:val="start"/>
+              <w:jc w:val="center"/>
             </w:pPr>
             <w:r>
               <w:rPr>
@@ -2012,7 +2012,7 @@
               <w:rPr>
                 <w:rFonts w:ascii="Calibri" w:hAnsi="Calibri"/>
                 <w:sz w:val="20"/>
-                <w:b w:val="true"/>
+                <w:i/>
               </w:rPr>
               <w:t xml:space="default">Fluvoxamine</w:t>
             </w:r>
@@ -2036,7 +2036,7 @@
             <w:pPr>
               <w:spacing w:before="0" w:after="60"/>
               <w:keepNext/>
-              <w:jc w:val="start"/>
+              <w:jc w:val="center"/>
             </w:pPr>
             <w:r>
               <w:rPr>
@@ -2060,7 +2060,7 @@
             <w:pPr>
               <w:spacing w:before="0" w:after="60"/>
               <w:keepNext/>
-              <w:jc w:val="start"/>
+              <w:jc w:val="center"/>
             </w:pPr>
             <w:r>
               <w:rPr>
@@ -2084,7 +2084,7 @@
             <w:pPr>
               <w:spacing w:before="0" w:after="60"/>
               <w:keepNext/>
-              <w:jc w:val="start"/>
+              <w:jc w:val="center"/>
             </w:pPr>
             <w:r>
               <w:rPr>
@@ -2109,7 +2109,7 @@
             <w:pPr>
               <w:spacing w:before="0" w:after="60"/>
               <w:keepNext/>
-              <w:jc w:val="start"/>
+              <w:jc w:val="center"/>
             </w:pPr>
             <w:r>
               <w:rPr>
@@ -2138,7 +2138,7 @@
             <w:pPr>
               <w:spacing w:before="0" w:after="60"/>
               <w:keepNext/>
-              <w:jc w:val="start"/>
+              <w:jc w:val="center"/>
             </w:pPr>
             <w:r>
               <w:rPr>
@@ -2162,7 +2162,7 @@
             <w:pPr>
               <w:spacing w:before="0" w:after="60"/>
               <w:keepNext/>
-              <w:jc w:val="start"/>
+              <w:jc w:val="center"/>
             </w:pPr>
             <w:r>
               <w:rPr>
@@ -2186,7 +2186,7 @@
             <w:pPr>
               <w:spacing w:before="0" w:after="60"/>
               <w:keepNext/>
-              <w:jc w:val="start"/>
+              <w:jc w:val="center"/>
             </w:pPr>
             <w:r>
               <w:rPr>
@@ -2211,7 +2211,7 @@
             <w:pPr>
               <w:spacing w:before="0" w:after="60"/>
               <w:keepNext/>
-              <w:jc w:val="start"/>
+              <w:jc w:val="center"/>
             </w:pPr>
             <w:r>
               <w:rPr>
@@ -2240,7 +2240,7 @@
             <w:pPr>
               <w:spacing w:before="0" w:after="60"/>
               <w:keepNext/>
-              <w:jc w:val="start"/>
+              <w:jc w:val="center"/>
             </w:pPr>
             <w:r>
               <w:rPr>
@@ -2264,7 +2264,7 @@
             <w:pPr>
               <w:spacing w:before="0" w:after="60"/>
               <w:keepNext/>
-              <w:jc w:val="start"/>
+              <w:jc w:val="center"/>
             </w:pPr>
             <w:r>
               <w:rPr>
@@ -2288,7 +2288,7 @@
             <w:pPr>
               <w:spacing w:before="0" w:after="60"/>
               <w:keepNext/>
-              <w:jc w:val="start"/>
+              <w:jc w:val="center"/>
             </w:pPr>
             <w:r>
               <w:rPr>
@@ -2313,7 +2313,7 @@
             <w:pPr>
               <w:spacing w:before="0" w:after="60"/>
               <w:keepNext/>
-              <w:jc w:val="start"/>
+              <w:jc w:val="center"/>
             </w:pPr>
             <w:r>
               <w:rPr>
@@ -2351,7 +2351,7 @@
               <w:rPr>
                 <w:rFonts w:ascii="Calibri" w:hAnsi="Calibri"/>
                 <w:sz w:val="20"/>
-                <w:b w:val="true"/>
+                <w:i/>
               </w:rPr>
               <w:t xml:space="default">Ketoconazole</w:t>
             </w:r>
@@ -2375,7 +2375,7 @@
             <w:pPr>
               <w:spacing w:before="0" w:after="60"/>
               <w:keepNext/>
-              <w:jc w:val="start"/>
+              <w:jc w:val="center"/>
             </w:pPr>
             <w:r>
               <w:rPr>
@@ -2399,7 +2399,7 @@
             <w:pPr>
               <w:spacing w:before="0" w:after="60"/>
               <w:keepNext/>
-              <w:jc w:val="start"/>
+              <w:jc w:val="center"/>
             </w:pPr>
             <w:r>
               <w:rPr>
@@ -2423,7 +2423,7 @@
             <w:pPr>
               <w:spacing w:before="0" w:after="60"/>
               <w:keepNext/>
-              <w:jc w:val="start"/>
+              <w:jc w:val="center"/>
             </w:pPr>
             <w:r>
               <w:rPr>
@@ -2448,7 +2448,7 @@
             <w:pPr>
               <w:spacing w:before="0" w:after="60"/>
               <w:keepNext/>
-              <w:jc w:val="start"/>
+              <w:jc w:val="center"/>
             </w:pPr>
             <w:r>
               <w:rPr>
@@ -2477,7 +2477,7 @@
             <w:pPr>
               <w:spacing w:before="0" w:after="60"/>
               <w:keepNext/>
-              <w:jc w:val="start"/>
+              <w:jc w:val="center"/>
             </w:pPr>
             <w:r>
               <w:rPr>
@@ -2501,7 +2501,7 @@
             <w:pPr>
               <w:spacing w:before="0" w:after="60"/>
               <w:keepNext/>
-              <w:jc w:val="start"/>
+              <w:jc w:val="center"/>
             </w:pPr>
             <w:r>
               <w:rPr>
@@ -2525,7 +2525,7 @@
             <w:pPr>
               <w:spacing w:before="0" w:after="60"/>
               <w:keepNext/>
-              <w:jc w:val="start"/>
+              <w:jc w:val="center"/>
             </w:pPr>
             <w:r>
               <w:rPr>
@@ -2550,7 +2550,7 @@
             <w:pPr>
               <w:spacing w:before="0" w:after="60"/>
               <w:keepNext/>
-              <w:jc w:val="start"/>
+              <w:jc w:val="center"/>
             </w:pPr>
             <w:r>
               <w:rPr>
@@ -2588,7 +2588,7 @@
               <w:rPr>
                 <w:rFonts w:ascii="Calibri" w:hAnsi="Calibri"/>
                 <w:sz w:val="20"/>
-                <w:b w:val="true"/>
+                <w:i/>
               </w:rPr>
               <w:t xml:space="default">Levodopa</w:t>
             </w:r>
@@ -2612,7 +2612,7 @@
             <w:pPr>
               <w:spacing w:before="0" w:after="60"/>
               <w:keepNext/>
-              <w:jc w:val="start"/>
+              <w:jc w:val="center"/>
             </w:pPr>
             <w:r>
               <w:rPr>
@@ -2636,7 +2636,7 @@
             <w:pPr>
               <w:spacing w:before="0" w:after="60"/>
               <w:keepNext/>
-              <w:jc w:val="start"/>
+              <w:jc w:val="center"/>
             </w:pPr>
             <w:r>
               <w:rPr>
@@ -2660,7 +2660,7 @@
             <w:pPr>
               <w:spacing w:before="0" w:after="60"/>
               <w:keepNext/>
-              <w:jc w:val="start"/>
+              <w:jc w:val="center"/>
             </w:pPr>
             <w:r>
               <w:rPr>
@@ -2685,7 +2685,7 @@
             <w:pPr>
               <w:spacing w:before="0" w:after="60"/>
               <w:keepNext/>
-              <w:jc w:val="start"/>
+              <w:jc w:val="center"/>
             </w:pPr>
             <w:r>
               <w:rPr>
@@ -2714,7 +2714,7 @@
             <w:pPr>
               <w:spacing w:before="0" w:after="60"/>
               <w:keepNext/>
-              <w:jc w:val="start"/>
+              <w:jc w:val="center"/>
             </w:pPr>
             <w:r>
               <w:rPr>
@@ -2738,7 +2738,7 @@
             <w:pPr>
               <w:spacing w:before="0" w:after="60"/>
               <w:keepNext/>
-              <w:jc w:val="start"/>
+              <w:jc w:val="center"/>
             </w:pPr>
             <w:r>
               <w:rPr>
@@ -2762,7 +2762,7 @@
             <w:pPr>
               <w:spacing w:before="0" w:after="60"/>
               <w:keepNext/>
-              <w:jc w:val="start"/>
+              <w:jc w:val="center"/>
             </w:pPr>
             <w:r>
               <w:rPr>
@@ -2787,7 +2787,7 @@
             <w:pPr>
               <w:spacing w:before="0" w:after="60"/>
               <w:keepNext/>
-              <w:jc w:val="start"/>
+              <w:jc w:val="center"/>
             </w:pPr>
             <w:r>
               <w:rPr>
@@ -2816,7 +2816,7 @@
             <w:pPr>
               <w:spacing w:before="0" w:after="60"/>
               <w:keepNext/>
-              <w:jc w:val="start"/>
+              <w:jc w:val="center"/>
             </w:pPr>
             <w:r>
               <w:rPr>
@@ -2840,7 +2840,7 @@
             <w:pPr>
               <w:spacing w:before="0" w:after="60"/>
               <w:keepNext/>
-              <w:jc w:val="start"/>
+              <w:jc w:val="center"/>
             </w:pPr>
             <w:r>
               <w:rPr>
@@ -2864,7 +2864,7 @@
             <w:pPr>
               <w:spacing w:before="0" w:after="60"/>
               <w:keepNext/>
-              <w:jc w:val="start"/>
+              <w:jc w:val="center"/>
             </w:pPr>
             <w:r>
               <w:rPr>
@@ -2889,7 +2889,7 @@
             <w:pPr>
               <w:spacing w:before="0" w:after="60"/>
               <w:keepNext/>
-              <w:jc w:val="start"/>
+              <w:jc w:val="center"/>
             </w:pPr>
             <w:r>
               <w:rPr>
@@ -2927,7 +2927,7 @@
               <w:rPr>
                 <w:rFonts w:ascii="Calibri" w:hAnsi="Calibri"/>
                 <w:sz w:val="20"/>
-                <w:b w:val="true"/>
+                <w:i/>
               </w:rPr>
               <w:t xml:space="default">Luteolin</w:t>
             </w:r>
@@ -2951,7 +2951,7 @@
             <w:pPr>
               <w:spacing w:before="0" w:after="60"/>
               <w:keepNext/>
-              <w:jc w:val="start"/>
+              <w:jc w:val="center"/>
             </w:pPr>
             <w:r>
               <w:rPr>
@@ -2975,7 +2975,7 @@
             <w:pPr>
               <w:spacing w:before="0" w:after="60"/>
               <w:keepNext/>
-              <w:jc w:val="start"/>
+              <w:jc w:val="center"/>
             </w:pPr>
             <w:r>
               <w:rPr>
@@ -2999,7 +2999,7 @@
             <w:pPr>
               <w:spacing w:before="0" w:after="60"/>
               <w:keepNext/>
-              <w:jc w:val="start"/>
+              <w:jc w:val="center"/>
             </w:pPr>
             <w:r>
               <w:rPr>
@@ -3024,7 +3024,7 @@
             <w:pPr>
               <w:spacing w:before="0" w:after="60"/>
               <w:keepNext/>
-              <w:jc w:val="start"/>
+              <w:jc w:val="center"/>
             </w:pPr>
             <w:r>
               <w:rPr>
@@ -3053,7 +3053,7 @@
             <w:pPr>
               <w:spacing w:before="0" w:after="60"/>
               <w:keepNext/>
-              <w:jc w:val="start"/>
+              <w:jc w:val="center"/>
             </w:pPr>
             <w:r>
               <w:rPr>
@@ -3077,7 +3077,7 @@
             <w:pPr>
               <w:spacing w:before="0" w:after="60"/>
               <w:keepNext/>
-              <w:jc w:val="start"/>
+              <w:jc w:val="center"/>
             </w:pPr>
             <w:r>
               <w:rPr>
@@ -3101,7 +3101,7 @@
             <w:pPr>
               <w:spacing w:before="0" w:after="60"/>
               <w:keepNext/>
-              <w:jc w:val="start"/>
+              <w:jc w:val="center"/>
             </w:pPr>
             <w:r>
               <w:rPr>
@@ -3126,7 +3126,7 @@
             <w:pPr>
               <w:spacing w:before="0" w:after="60"/>
               <w:keepNext/>
-              <w:jc w:val="start"/>
+              <w:jc w:val="center"/>
             </w:pPr>
             <w:r>
               <w:rPr>
@@ -3164,7 +3164,7 @@
               <w:rPr>
                 <w:rFonts w:ascii="Calibri" w:hAnsi="Calibri"/>
                 <w:sz w:val="20"/>
-                <w:b w:val="true"/>
+                <w:i/>
               </w:rPr>
               <w:t xml:space="default">Melatonin</w:t>
             </w:r>
@@ -3188,7 +3188,7 @@
             <w:pPr>
               <w:spacing w:before="0" w:after="60"/>
               <w:keepNext/>
-              <w:jc w:val="start"/>
+              <w:jc w:val="center"/>
             </w:pPr>
             <w:r>
               <w:rPr>
@@ -3212,7 +3212,7 @@
             <w:pPr>
               <w:spacing w:before="0" w:after="60"/>
               <w:keepNext/>
-              <w:jc w:val="start"/>
+              <w:jc w:val="center"/>
             </w:pPr>
             <w:r>
               <w:rPr>
@@ -3236,7 +3236,7 @@
             <w:pPr>
               <w:spacing w:before="0" w:after="60"/>
               <w:keepNext/>
-              <w:jc w:val="start"/>
+              <w:jc w:val="center"/>
             </w:pPr>
             <w:r>
               <w:rPr>
@@ -3261,7 +3261,7 @@
             <w:pPr>
               <w:spacing w:before="0" w:after="60"/>
               <w:keepNext/>
-              <w:jc w:val="start"/>
+              <w:jc w:val="center"/>
             </w:pPr>
             <w:r>
               <w:rPr>
@@ -3290,7 +3290,7 @@
             <w:pPr>
               <w:spacing w:before="0" w:after="60"/>
               <w:keepNext/>
-              <w:jc w:val="start"/>
+              <w:jc w:val="center"/>
             </w:pPr>
             <w:r>
               <w:rPr>
@@ -3314,7 +3314,7 @@
             <w:pPr>
               <w:spacing w:before="0" w:after="60"/>
               <w:keepNext/>
-              <w:jc w:val="start"/>
+              <w:jc w:val="center"/>
             </w:pPr>
             <w:r>
               <w:rPr>
@@ -3338,7 +3338,7 @@
             <w:pPr>
               <w:spacing w:before="0" w:after="60"/>
               <w:keepNext/>
-              <w:jc w:val="start"/>
+              <w:jc w:val="center"/>
             </w:pPr>
             <w:r>
               <w:rPr>
@@ -3363,7 +3363,7 @@
             <w:pPr>
               <w:spacing w:before="0" w:after="60"/>
               <w:keepNext/>
-              <w:jc w:val="start"/>
+              <w:jc w:val="center"/>
             </w:pPr>
             <w:r>
               <w:rPr>
@@ -3401,7 +3401,7 @@
               <w:rPr>
                 <w:rFonts w:ascii="Calibri" w:hAnsi="Calibri"/>
                 <w:sz w:val="20"/>
-                <w:b w:val="true"/>
+                <w:i/>
               </w:rPr>
               <w:t xml:space="default">Metformin</w:t>
             </w:r>
@@ -3425,7 +3425,7 @@
             <w:pPr>
               <w:spacing w:before="0" w:after="60"/>
               <w:keepNext/>
-              <w:jc w:val="start"/>
+              <w:jc w:val="center"/>
             </w:pPr>
             <w:r>
               <w:rPr>
@@ -3449,7 +3449,7 @@
             <w:pPr>
               <w:spacing w:before="0" w:after="60"/>
               <w:keepNext/>
-              <w:jc w:val="start"/>
+              <w:jc w:val="center"/>
             </w:pPr>
             <w:r>
               <w:rPr>
@@ -3473,7 +3473,7 @@
             <w:pPr>
               <w:spacing w:before="0" w:after="60"/>
               <w:keepNext/>
-              <w:jc w:val="start"/>
+              <w:jc w:val="center"/>
             </w:pPr>
             <w:r>
               <w:rPr>
@@ -3498,7 +3498,7 @@
             <w:pPr>
               <w:spacing w:before="0" w:after="60"/>
               <w:keepNext/>
-              <w:jc w:val="start"/>
+              <w:jc w:val="center"/>
             </w:pPr>
             <w:r>
               <w:rPr>
@@ -3527,7 +3527,7 @@
             <w:pPr>
               <w:spacing w:before="0" w:after="60"/>
               <w:keepNext/>
-              <w:jc w:val="start"/>
+              <w:jc w:val="center"/>
             </w:pPr>
             <w:r>
               <w:rPr>
@@ -3551,7 +3551,7 @@
             <w:pPr>
               <w:spacing w:before="0" w:after="60"/>
               <w:keepNext/>
-              <w:jc w:val="start"/>
+              <w:jc w:val="center"/>
             </w:pPr>
             <w:r>
               <w:rPr>
@@ -3575,7 +3575,7 @@
             <w:pPr>
               <w:spacing w:before="0" w:after="60"/>
               <w:keepNext/>
-              <w:jc w:val="start"/>
+              <w:jc w:val="center"/>
             </w:pPr>
             <w:r>
               <w:rPr>
@@ -3600,7 +3600,7 @@
             <w:pPr>
               <w:spacing w:before="0" w:after="60"/>
               <w:keepNext/>
-              <w:jc w:val="start"/>
+              <w:jc w:val="center"/>
             </w:pPr>
             <w:r>
               <w:rPr>
@@ -3629,7 +3629,7 @@
             <w:pPr>
               <w:spacing w:before="0" w:after="60"/>
               <w:keepNext/>
-              <w:jc w:val="start"/>
+              <w:jc w:val="center"/>
             </w:pPr>
             <w:r>
               <w:rPr>
@@ -3653,7 +3653,7 @@
             <w:pPr>
               <w:spacing w:before="0" w:after="60"/>
               <w:keepNext/>
-              <w:jc w:val="start"/>
+              <w:jc w:val="center"/>
             </w:pPr>
             <w:r>
               <w:rPr>
@@ -3677,7 +3677,7 @@
             <w:pPr>
               <w:spacing w:before="0" w:after="60"/>
               <w:keepNext/>
-              <w:jc w:val="start"/>
+              <w:jc w:val="center"/>
             </w:pPr>
             <w:r>
               <w:rPr>
@@ -3702,7 +3702,7 @@
             <w:pPr>
               <w:spacing w:before="0" w:after="60"/>
               <w:keepNext/>
-              <w:jc w:val="start"/>
+              <w:jc w:val="center"/>
             </w:pPr>
             <w:r>
               <w:rPr>
@@ -3731,7 +3731,7 @@
             <w:pPr>
               <w:spacing w:before="0" w:after="60"/>
               <w:keepNext/>
-              <w:jc w:val="start"/>
+              <w:jc w:val="center"/>
             </w:pPr>
             <w:r>
               <w:rPr>
@@ -3755,7 +3755,7 @@
             <w:pPr>
               <w:spacing w:before="0" w:after="60"/>
               <w:keepNext/>
-              <w:jc w:val="start"/>
+              <w:jc w:val="center"/>
             </w:pPr>
             <w:r>
               <w:rPr>
@@ -3779,7 +3779,7 @@
             <w:pPr>
               <w:spacing w:before="0" w:after="60"/>
               <w:keepNext/>
-              <w:jc w:val="start"/>
+              <w:jc w:val="center"/>
             </w:pPr>
             <w:r>
               <w:rPr>
@@ -3804,7 +3804,7 @@
             <w:pPr>
               <w:spacing w:before="0" w:after="60"/>
               <w:keepNext/>
-              <w:jc w:val="start"/>
+              <w:jc w:val="center"/>
             </w:pPr>
             <w:r>
               <w:rPr>
@@ -3842,7 +3842,7 @@
               <w:rPr>
                 <w:rFonts w:ascii="Calibri" w:hAnsi="Calibri"/>
                 <w:sz w:val="20"/>
-                <w:b w:val="true"/>
+                <w:i/>
               </w:rPr>
               <w:t xml:space="default">Minocycline</w:t>
             </w:r>
@@ -3866,7 +3866,7 @@
             <w:pPr>
               <w:spacing w:before="0" w:after="60"/>
               <w:keepNext/>
-              <w:jc w:val="start"/>
+              <w:jc w:val="center"/>
             </w:pPr>
             <w:r>
               <w:rPr>
@@ -3890,7 +3890,7 @@
             <w:pPr>
               <w:spacing w:before="0" w:after="60"/>
               <w:keepNext/>
-              <w:jc w:val="start"/>
+              <w:jc w:val="center"/>
             </w:pPr>
             <w:r>
               <w:rPr>
@@ -3914,7 +3914,7 @@
             <w:pPr>
               <w:spacing w:before="0" w:after="60"/>
               <w:keepNext/>
-              <w:jc w:val="start"/>
+              <w:jc w:val="center"/>
             </w:pPr>
             <w:r>
               <w:rPr>
@@ -3939,7 +3939,7 @@
             <w:pPr>
               <w:spacing w:before="0" w:after="60"/>
               <w:keepNext/>
-              <w:jc w:val="start"/>
+              <w:jc w:val="center"/>
             </w:pPr>
             <w:r>
               <w:rPr>
@@ -3968,7 +3968,7 @@
             <w:pPr>
               <w:spacing w:before="0" w:after="60"/>
               <w:keepNext/>
-              <w:jc w:val="start"/>
+              <w:jc w:val="center"/>
             </w:pPr>
             <w:r>
               <w:rPr>
@@ -3992,7 +3992,7 @@
             <w:pPr>
               <w:spacing w:before="0" w:after="60"/>
               <w:keepNext/>
-              <w:jc w:val="start"/>
+              <w:jc w:val="center"/>
             </w:pPr>
             <w:r>
               <w:rPr>
@@ -4016,7 +4016,7 @@
             <w:pPr>
               <w:spacing w:before="0" w:after="60"/>
               <w:keepNext/>
-              <w:jc w:val="start"/>
+              <w:jc w:val="center"/>
             </w:pPr>
             <w:r>
               <w:rPr>
@@ -4041,7 +4041,7 @@
             <w:pPr>
               <w:spacing w:before="0" w:after="60"/>
               <w:keepNext/>
-              <w:jc w:val="start"/>
+              <w:jc w:val="center"/>
             </w:pPr>
             <w:r>
               <w:rPr>
@@ -4070,7 +4070,7 @@
             <w:pPr>
               <w:spacing w:before="0" w:after="60"/>
               <w:keepNext/>
-              <w:jc w:val="start"/>
+              <w:jc w:val="center"/>
             </w:pPr>
             <w:r>
               <w:rPr>
@@ -4094,7 +4094,7 @@
             <w:pPr>
               <w:spacing w:before="0" w:after="60"/>
               <w:keepNext/>
-              <w:jc w:val="start"/>
+              <w:jc w:val="center"/>
             </w:pPr>
             <w:r>
               <w:rPr>
@@ -4118,7 +4118,7 @@
             <w:pPr>
               <w:spacing w:before="0" w:after="60"/>
               <w:keepNext/>
-              <w:jc w:val="start"/>
+              <w:jc w:val="center"/>
             </w:pPr>
             <w:r>
               <w:rPr>
@@ -4143,7 +4143,7 @@
             <w:pPr>
               <w:spacing w:before="0" w:after="60"/>
               <w:keepNext/>
-              <w:jc w:val="start"/>
+              <w:jc w:val="center"/>
             </w:pPr>
             <w:r>
               <w:rPr>
@@ -4181,7 +4181,7 @@
               <w:rPr>
                 <w:rFonts w:ascii="Calibri" w:hAnsi="Calibri"/>
                 <w:sz w:val="20"/>
-                <w:b w:val="true"/>
+                <w:i/>
               </w:rPr>
               <w:t xml:space="default">Resveratrol</w:t>
             </w:r>
@@ -4205,7 +4205,7 @@
             <w:pPr>
               <w:spacing w:before="0" w:after="60"/>
               <w:keepNext/>
-              <w:jc w:val="start"/>
+              <w:jc w:val="center"/>
             </w:pPr>
             <w:r>
               <w:rPr>
@@ -4229,7 +4229,7 @@
             <w:pPr>
               <w:spacing w:before="0" w:after="60"/>
               <w:keepNext/>
-              <w:jc w:val="start"/>
+              <w:jc w:val="center"/>
             </w:pPr>
             <w:r>
               <w:rPr>
@@ -4253,7 +4253,7 @@
             <w:pPr>
               <w:spacing w:before="0" w:after="60"/>
               <w:keepNext/>
-              <w:jc w:val="start"/>
+              <w:jc w:val="center"/>
             </w:pPr>
             <w:r>
               <w:rPr>
@@ -4278,7 +4278,7 @@
             <w:pPr>
               <w:spacing w:before="0" w:after="60"/>
               <w:keepNext/>
-              <w:jc w:val="start"/>
+              <w:jc w:val="center"/>
             </w:pPr>
             <w:r>
               <w:rPr>
@@ -4307,7 +4307,7 @@
             <w:pPr>
               <w:spacing w:before="0" w:after="60"/>
               <w:keepNext/>
-              <w:jc w:val="start"/>
+              <w:jc w:val="center"/>
             </w:pPr>
             <w:r>
               <w:rPr>
@@ -4331,7 +4331,7 @@
             <w:pPr>
               <w:spacing w:before="0" w:after="60"/>
               <w:keepNext/>
-              <w:jc w:val="start"/>
+              <w:jc w:val="center"/>
             </w:pPr>
             <w:r>
               <w:rPr>
@@ -4355,7 +4355,7 @@
             <w:pPr>
               <w:spacing w:before="0" w:after="60"/>
               <w:keepNext/>
-              <w:jc w:val="start"/>
+              <w:jc w:val="center"/>
             </w:pPr>
             <w:r>
               <w:rPr>
@@ -4380,7 +4380,7 @@
             <w:pPr>
               <w:spacing w:before="0" w:after="60"/>
               <w:keepNext/>
-              <w:jc w:val="start"/>
+              <w:jc w:val="center"/>
             </w:pPr>
             <w:r>
               <w:rPr>
@@ -4409,7 +4409,7 @@
             <w:pPr>
               <w:spacing w:before="0" w:after="60"/>
               <w:keepNext/>
-              <w:jc w:val="start"/>
+              <w:jc w:val="center"/>
             </w:pPr>
             <w:r>
               <w:rPr>
@@ -4433,7 +4433,7 @@
             <w:pPr>
               <w:spacing w:before="0" w:after="60"/>
               <w:keepNext/>
-              <w:jc w:val="start"/>
+              <w:jc w:val="center"/>
             </w:pPr>
             <w:r>
               <w:rPr>
@@ -4457,7 +4457,7 @@
             <w:pPr>
               <w:spacing w:before="0" w:after="60"/>
               <w:keepNext/>
-              <w:jc w:val="start"/>
+              <w:jc w:val="center"/>
             </w:pPr>
             <w:r>
               <w:rPr>
@@ -4482,7 +4482,7 @@
             <w:pPr>
               <w:spacing w:before="0" w:after="60"/>
               <w:keepNext/>
-              <w:jc w:val="start"/>
+              <w:jc w:val="center"/>
             </w:pPr>
             <w:r>
               <w:rPr>
@@ -4520,7 +4520,7 @@
               <w:rPr>
                 <w:rFonts w:ascii="Calibri" w:hAnsi="Calibri"/>
                 <w:sz w:val="20"/>
-                <w:b w:val="true"/>
+                <w:i/>
               </w:rPr>
               <w:t xml:space="default">Roscovitine</w:t>
             </w:r>
@@ -4544,7 +4544,7 @@
             <w:pPr>
               <w:spacing w:before="0" w:after="60"/>
               <w:keepNext/>
-              <w:jc w:val="start"/>
+              <w:jc w:val="center"/>
             </w:pPr>
             <w:r>
               <w:rPr>
@@ -4568,7 +4568,7 @@
             <w:pPr>
               <w:spacing w:before="0" w:after="60"/>
               <w:keepNext/>
-              <w:jc w:val="start"/>
+              <w:jc w:val="center"/>
             </w:pPr>
             <w:r>
               <w:rPr>
@@ -4592,7 +4592,7 @@
             <w:pPr>
               <w:spacing w:before="0" w:after="60"/>
               <w:keepNext/>
-              <w:jc w:val="start"/>
+              <w:jc w:val="center"/>
             </w:pPr>
             <w:r>
               <w:rPr>
@@ -4617,7 +4617,7 @@
             <w:pPr>
               <w:spacing w:before="0" w:after="60"/>
               <w:keepNext/>
-              <w:jc w:val="start"/>
+              <w:jc w:val="center"/>
             </w:pPr>
             <w:r>
               <w:rPr>
@@ -4655,7 +4655,7 @@
               <w:rPr>
                 <w:rFonts w:ascii="Calibri" w:hAnsi="Calibri"/>
                 <w:sz w:val="20"/>
-                <w:b w:val="true"/>
+                <w:i/>
               </w:rPr>
               <w:t xml:space="default">Sertraline</w:t>
             </w:r>
@@ -4679,7 +4679,7 @@
             <w:pPr>
               <w:spacing w:before="0" w:after="60"/>
               <w:keepNext/>
-              <w:jc w:val="start"/>
+              <w:jc w:val="center"/>
             </w:pPr>
             <w:r>
               <w:rPr>
@@ -4703,7 +4703,7 @@
             <w:pPr>
               <w:spacing w:before="0" w:after="60"/>
               <w:keepNext/>
-              <w:jc w:val="start"/>
+              <w:jc w:val="center"/>
             </w:pPr>
             <w:r>
               <w:rPr>
@@ -4727,7 +4727,7 @@
             <w:pPr>
               <w:spacing w:before="0" w:after="60"/>
               <w:keepNext/>
-              <w:jc w:val="start"/>
+              <w:jc w:val="center"/>
             </w:pPr>
             <w:r>
               <w:rPr>
@@ -4752,7 +4752,7 @@
             <w:pPr>
               <w:spacing w:before="0" w:after="60"/>
               <w:keepNext/>
-              <w:jc w:val="start"/>
+              <w:jc w:val="center"/>
             </w:pPr>
             <w:r>
               <w:rPr>
@@ -4781,7 +4781,7 @@
             <w:pPr>
               <w:spacing w:before="0" w:after="60"/>
               <w:keepNext/>
-              <w:jc w:val="start"/>
+              <w:jc w:val="center"/>
             </w:pPr>
             <w:r>
               <w:rPr>
@@ -4805,7 +4805,7 @@
             <w:pPr>
               <w:spacing w:before="0" w:after="60"/>
               <w:keepNext/>
-              <w:jc w:val="start"/>
+              <w:jc w:val="center"/>
             </w:pPr>
             <w:r>
               <w:rPr>
@@ -4829,7 +4829,7 @@
             <w:pPr>
               <w:spacing w:before="0" w:after="60"/>
               <w:keepNext/>
-              <w:jc w:val="start"/>
+              <w:jc w:val="center"/>
             </w:pPr>
             <w:r>
               <w:rPr>
@@ -4854,7 +4854,7 @@
             <w:pPr>
               <w:spacing w:before="0" w:after="60"/>
               <w:keepNext/>
-              <w:jc w:val="start"/>
+              <w:jc w:val="center"/>
             </w:pPr>
             <w:r>
               <w:rPr>
@@ -4883,7 +4883,7 @@
             <w:pPr>
               <w:spacing w:before="0" w:after="60"/>
               <w:keepNext/>
-              <w:jc w:val="start"/>
+              <w:jc w:val="center"/>
             </w:pPr>
             <w:r>
               <w:rPr>
@@ -4907,7 +4907,7 @@
             <w:pPr>
               <w:spacing w:before="0" w:after="60"/>
               <w:keepNext/>
-              <w:jc w:val="start"/>
+              <w:jc w:val="center"/>
             </w:pPr>
             <w:r>
               <w:rPr>
@@ -4931,7 +4931,7 @@
             <w:pPr>
               <w:spacing w:before="0" w:after="60"/>
               <w:keepNext/>
-              <w:jc w:val="start"/>
+              <w:jc w:val="center"/>
             </w:pPr>
             <w:r>
               <w:rPr>
@@ -4956,7 +4956,7 @@
             <w:pPr>
               <w:spacing w:before="0" w:after="60"/>
               <w:keepNext/>
-              <w:jc w:val="start"/>
+              <w:jc w:val="center"/>
             </w:pPr>
             <w:r>
               <w:rPr>
@@ -4985,7 +4985,7 @@
             <w:pPr>
               <w:spacing w:before="0" w:after="60"/>
               <w:keepNext/>
-              <w:jc w:val="start"/>
+              <w:jc w:val="center"/>
             </w:pPr>
             <w:r>
               <w:rPr>
@@ -5009,7 +5009,7 @@
             <w:pPr>
               <w:spacing w:before="0" w:after="60"/>
               <w:keepNext/>
-              <w:jc w:val="start"/>
+              <w:jc w:val="center"/>
             </w:pPr>
             <w:r>
               <w:rPr>
@@ -5033,7 +5033,7 @@
             <w:pPr>
               <w:spacing w:before="0" w:after="60"/>
               <w:keepNext/>
-              <w:jc w:val="start"/>
+              <w:jc w:val="center"/>
             </w:pPr>
             <w:r>
               <w:rPr>
@@ -5058,7 +5058,7 @@
             <w:pPr>
               <w:spacing w:before="0" w:after="60"/>
               <w:keepNext/>
-              <w:jc w:val="start"/>
+              <w:jc w:val="center"/>
             </w:pPr>
             <w:r>
               <w:rPr>

</xml_diff>